<commit_message>
Tag three pieces as censorship
Co-Authored-By: Claude Sonnet 5.5 <noreply@anthropic.com>
</commit_message>
<xml_diff>
--- a/content-src/docx/R TLS 1994 04 22 Horror Movies.docx
+++ b/content-src/docx/R TLS 1994 04 22 Horror Movies.docx
@@ -33,6 +33,11 @@
       </w:r>
       <w:r>
         <w:t xml:space="preserve">Fredric Jameson SIGNATURES OF THE VISIBLE 254pp. Routledge. £10.99.&lt;/details&gt;</w:t>
+      </w:r>
+    </w:p>
+    <w:p>
+      <w:r>
+        <w:t>&lt;category&gt;censorship&lt;/category&gt;</w:t>
       </w:r>
     </w:p>
     <w:p>

</xml_diff>